<commit_message>
feat: Dashboard, Reportes y Notificaciones - v2.1.0
## Nuevos Módulos
- Dashboard con estadísticas diferenciadas por rol (Admin/REPRO vs Empresa)
- Reportes de Evaluaciones y Empresas con exportación PDF/Excel
- Notificaciones Email (automáticas y manuales)

## Mejoras en Cuestionarios (Admin)
- 6 tarjetas estadísticas (Total, Pendientes, En Progreso, Completados, Hoy, Tasa)
- Columna Orden con link directo
- Columna Contacto (email, tel, cel)
- Columna Servicio/Formulario
- Botón reenviar correo al evaluado

## Mejoras en Órdenes
- Botón reenviar correo a evaluados
- Regeneración de token expirado

## Tests
- 74+ tests automatizados
- Dashboard: 6 tests
- Reportes: 10 tests
- Notificaciones: 8 tests
- Órdenes: 7 tests

## Documentación
- Actualizado ESTADO_ACTUAL.md
- Actualizado CONTEXTO_AGENTES.md
- Actualizado CHANGELOG.md
</commit_message>
<xml_diff>
--- a/public/Formularios/PERIODICO ESPECIFICO.docx
+++ b/public/Formularios/PERIODICO ESPECIFICO.docx
@@ -14,6 +14,9 @@
         </w:rPr>
       </w:pPr>
       <w:r>
+        <w:rPr>
+          <w:noProof/>
+        </w:rPr>
         <w:drawing>
           <wp:anchor distT="0" distB="0" distL="114300" distR="114300" simplePos="0" relativeHeight="487593984" behindDoc="1" locked="0" layoutInCell="1" allowOverlap="1" wp14:anchorId="20B50468" wp14:editId="298FB897">
             <wp:simplePos x="0" y="0"/>
@@ -494,10 +497,11 @@
         <w:rPr>
           <w:rFonts w:ascii="Helvetica" w:hAnsi="Helvetica"/>
           <w:b/>
+          <w:noProof/>
           <w:u w:val="single"/>
         </w:rPr>
         <w:drawing>
-          <wp:anchor distT="0" distB="0" distL="114300" distR="114300" simplePos="0" relativeHeight="487591936" behindDoc="0" locked="0" layoutInCell="1" allowOverlap="1" wp14:anchorId="74667918" wp14:editId="66A36E8C">
+          <wp:anchor distT="0" distB="0" distL="114300" distR="114300" simplePos="0" relativeHeight="487591936" behindDoc="0" locked="0" layoutInCell="1" allowOverlap="1" wp14:anchorId="74667918" wp14:editId="322C908A">
             <wp:simplePos x="0" y="0"/>
             <wp:positionH relativeFrom="column">
               <wp:posOffset>2252980</wp:posOffset>
@@ -5998,15 +6002,7 @@
                 <w:sz w:val="22"/>
                 <w:szCs w:val="22"/>
               </w:rPr>
-              <w:t>Negó haber presenciado conductas indebidas o actividades ilícitas por parte de sus compañeros durante el ejercicio de sus funciones dentro de la empresa.</w:t>
-            </w:r>
-            <w:r>
-              <w:rPr>
-                <w:rFonts w:ascii="Helvetica" w:hAnsi="Helvetica"/>
-                <w:sz w:val="22"/>
-                <w:szCs w:val="22"/>
-              </w:rPr>
-              <w:t xml:space="preserve"> Así mismo negó haber amenazado en alguna ocasión al personal. </w:t>
+              <w:t xml:space="preserve">Negó haber presenciado conductas indebidas o actividades ilícitas por parte de sus compañeros durante el ejercicio de sus funciones dentro de la empresa. Así mismo negó haber amenazado en alguna ocasión al personal. </w:t>
             </w:r>
           </w:p>
           <w:p>
@@ -6284,13 +6280,7 @@
               <w:rPr>
                 <w:highlight w:val="yellow"/>
               </w:rPr>
-              <w:t>También</w:t>
-            </w:r>
-            <w:r>
-              <w:rPr>
-                <w:highlight w:val="yellow"/>
-              </w:rPr>
-              <w:t xml:space="preserve"> recuerdo que me menciono que bodega no les mandaba el producto que pedían, a veces </w:t>
+              <w:t xml:space="preserve">También recuerdo que me menciono que bodega no les mandaba el producto que pedían, a veces </w:t>
             </w:r>
             <w:proofErr w:type="spellStart"/>
             <w:r>
@@ -6360,6 +6350,7 @@
               <w:rPr>
                 <w:rFonts w:ascii="Helvetica" w:hAnsi="Helvetica"/>
                 <w:b/>
+                <w:noProof/>
               </w:rPr>
               <mc:AlternateContent>
                 <mc:Choice Requires="wps">
@@ -6420,17 +6411,7 @@
                                       <w:sz w:val="32"/>
                                       <w:szCs w:val="40"/>
                                     </w:rPr>
-                                    <w:t>Recomendaciones</w:t>
-                                  </w:r>
-                                  <w:r>
-                                    <w:rPr>
-                                      <w:rFonts w:ascii="Helvetica" w:eastAsia="Times New Roman" w:hAnsi="Helvetica" w:cs="Times New Roman"/>
-                                      <w:b/>
-                                      <w:bCs/>
-                                      <w:sz w:val="32"/>
-                                      <w:szCs w:val="40"/>
-                                    </w:rPr>
-                                    <w:t>:</w:t>
+                                    <w:t>Recomendaciones:</w:t>
                                   </w:r>
                                 </w:p>
                                 <w:p>
@@ -6473,19 +6454,7 @@
                                     <w:rPr>
                                       <w:rFonts w:ascii="Helvetica" w:eastAsia="Times New Roman" w:hAnsi="Helvetica" w:cs="Times New Roman"/>
                                     </w:rPr>
-                                    <w:t xml:space="preserve">Suspender inventarios mientras la sucursal está en operación; </w:t>
-                                  </w:r>
-                                  <w:r>
-                                    <w:rPr>
-                                      <w:rFonts w:ascii="Helvetica" w:eastAsia="Times New Roman" w:hAnsi="Helvetica" w:cs="Times New Roman"/>
-                                    </w:rPr>
-                                    <w:t>se sugiere</w:t>
-                                  </w:r>
-                                  <w:r>
-                                    <w:rPr>
-                                      <w:rFonts w:ascii="Helvetica" w:eastAsia="Times New Roman" w:hAnsi="Helvetica" w:cs="Times New Roman"/>
-                                    </w:rPr>
-                                    <w:t xml:space="preserve"> realizarse en horarios de cierre o con personal extra designado.</w:t>
+                                    <w:t>Suspender inventarios mientras la sucursal está en operación; se sugiere realizarse en horarios de cierre o con personal extra designado.</w:t>
                                   </w:r>
                                 </w:p>
                                 <w:p>
@@ -6672,13 +6641,7 @@
                                     <w:rPr>
                                       <w:rFonts w:ascii="Helvetica" w:eastAsia="Times New Roman" w:hAnsi="Helvetica" w:cs="Times New Roman"/>
                                     </w:rPr>
-                                    <w:t>En caso de responsabilidad comprobada, implementar mecanismos documentados de reposición</w:t>
-                                  </w:r>
-                                  <w:r>
-                                    <w:rPr>
-                                      <w:rFonts w:ascii="Helvetica" w:eastAsia="Times New Roman" w:hAnsi="Helvetica" w:cs="Times New Roman"/>
-                                    </w:rPr>
-                                    <w:t>.</w:t>
+                                    <w:t>En caso de responsabilidad comprobada, implementar mecanismos documentados de reposición.</w:t>
                                   </w:r>
                                 </w:p>
                                 <w:p>
@@ -10078,6 +10041,7 @@
         <w:rPr>
           <w:rFonts w:ascii="Helvetica" w:hAnsi="Helvetica"/>
           <w:b/>
+          <w:noProof/>
         </w:rPr>
         <w:lastRenderedPageBreak/>
         <w:drawing>
@@ -10137,6 +10101,7 @@
       <w:r>
         <w:rPr>
           <w:rFonts w:ascii="Helvetica" w:hAnsi="Helvetica"/>
+          <w:noProof/>
         </w:rPr>
         <mc:AlternateContent>
           <mc:Choice Requires="wps">
@@ -11393,6 +11358,7 @@
         <w:rPr>
           <w:rFonts w:ascii="Helvetica" w:hAnsi="Helvetica"/>
           <w:b/>
+          <w:noProof/>
         </w:rPr>
         <mc:AlternateContent>
           <mc:Choice Requires="wps">
@@ -12130,6 +12096,7 @@
         <w:rPr>
           <w:rFonts w:ascii="Helvetica" w:hAnsi="Helvetica"/>
           <w:b/>
+          <w:noProof/>
         </w:rPr>
         <w:drawing>
           <wp:anchor distT="0" distB="0" distL="0" distR="0" simplePos="0" relativeHeight="487590912" behindDoc="1" locked="0" layoutInCell="1" allowOverlap="1" wp14:anchorId="1CE88082" wp14:editId="50DAB10B">
@@ -12321,6 +12288,7 @@
       <w:r>
         <w:rPr>
           <w:rFonts w:ascii="Helvetica" w:hAnsi="Helvetica"/>
+          <w:noProof/>
         </w:rPr>
         <mc:AlternateContent>
           <mc:Choice Requires="wps">
@@ -12443,6 +12411,7 @@
       <w:r>
         <w:rPr>
           <w:rFonts w:ascii="Helvetica" w:hAnsi="Helvetica"/>
+          <w:noProof/>
         </w:rPr>
         <w:drawing>
           <wp:anchor distT="0" distB="0" distL="114300" distR="114300" simplePos="0" relativeHeight="487596032" behindDoc="0" locked="0" layoutInCell="1" allowOverlap="1" wp14:anchorId="6B9B4ED8" wp14:editId="4C8333DD">
@@ -12517,6 +12486,7 @@
       <w:r>
         <w:rPr>
           <w:rFonts w:ascii="Helvetica" w:hAnsi="Helvetica"/>
+          <w:noProof/>
         </w:rPr>
         <w:lastRenderedPageBreak/>
         <w:drawing>
@@ -12617,6 +12587,7 @@
     </w:pPr>
     <w:r>
       <w:rPr>
+        <w:noProof/>
         <w:sz w:val="20"/>
       </w:rPr>
       <w:drawing>
@@ -12693,6 +12664,7 @@
     </w:pPr>
     <w:r>
       <w:rPr>
+        <w:noProof/>
         <w:sz w:val="20"/>
       </w:rPr>
       <w:drawing>
@@ -12769,6 +12741,7 @@
     </w:pPr>
     <w:r>
       <w:rPr>
+        <w:noProof/>
         <w:sz w:val="20"/>
       </w:rPr>
       <w:drawing>
@@ -14502,6 +14475,7 @@
   <w:style w:type="character" w:default="1" w:styleId="Fuentedeprrafopredeter">
     <w:name w:val="Default Paragraph Font"/>
     <w:uiPriority w:val="1"/>
+    <w:semiHidden/>
     <w:unhideWhenUsed/>
   </w:style>
   <w:style w:type="table" w:default="1" w:styleId="Tablanormal">

</xml_diff>